<commit_message>
chore: going through ressearch questions
</commit_message>
<xml_diff>
--- a/51IP Injenerija prykladnyh zastosunkiv/2/IP_KNT-122_Onyshchenko_19_PR2.docx
+++ b/51IP Injenerija prykladnyh zastosunkiv/2/IP_KNT-122_Onyshchenko_19_PR2.docx
@@ -486,6 +486,154 @@
       </w:pPr>
       <w:r>
         <w:rPr/>
+        <w:t>2. Обрати вхідні дані, подані у графічних зображень, для подальшої їх обробки та аналізу.</w:t>
+      </w:r>
+    </w:p>
+    <w:p>
+      <w:pPr>
+        <w:pStyle w:val="p11"/>
+        <w:rPr/>
+      </w:pPr>
+      <w:r>
+        <w:rPr/>
+        <w:t>Як вхідні дані можна обрати, наприклад, такі:</w:t>
+      </w:r>
+    </w:p>
+    <w:p>
+      <w:pPr>
+        <w:pStyle w:val="p11"/>
+        <w:rPr/>
+      </w:pPr>
+      <w:r>
+        <w:rPr/>
+        <w:t xml:space="preserve">– </w:t>
+      </w:r>
+      <w:r>
+        <w:rPr/>
+        <w:t xml:space="preserve">дані з відомих репозиторіїв. Наприклад, з репозиторію TensorFlow: </w:t>
+      </w:r>
+      <w:hyperlink r:id="rId2">
+        <w:r>
+          <w:rPr>
+            <w:rStyle w:val="Hyperlink"/>
+          </w:rPr>
+          <w:t>https://www.tensorflow.org/datasets</w:t>
+        </w:r>
+      </w:hyperlink>
+      <w:r>
+        <w:rPr/>
+        <w:t>;</w:t>
+      </w:r>
+    </w:p>
+    <w:p>
+      <w:pPr>
+        <w:pStyle w:val="p11"/>
+        <w:rPr/>
+      </w:pPr>
+      <w:r>
+        <w:rPr/>
+        <w:t xml:space="preserve">– </w:t>
+      </w:r>
+      <w:r>
+        <w:rPr/>
+        <w:t>дані з предметної області, що є добре відомою для студента;</w:t>
+      </w:r>
+    </w:p>
+    <w:p>
+      <w:pPr>
+        <w:pStyle w:val="p11"/>
+        <w:rPr/>
+      </w:pPr>
+      <w:r>
+        <w:rPr/>
+        <w:t xml:space="preserve">– </w:t>
+      </w:r>
+      <w:r>
+        <w:rPr/>
+        <w:t>спеціально згенеровані вхідні дані;</w:t>
+      </w:r>
+    </w:p>
+    <w:p>
+      <w:pPr>
+        <w:pStyle w:val="p11"/>
+        <w:rPr/>
+      </w:pPr>
+      <w:r>
+        <w:rPr/>
+        <w:t xml:space="preserve">– </w:t>
+      </w:r>
+      <w:r>
+        <w:rPr/>
+        <w:t>будь-які інші дані, які подані у вигляді графічних зображень.</w:t>
+      </w:r>
+    </w:p>
+    <w:p>
+      <w:pPr>
+        <w:pStyle w:val="p11"/>
+        <w:rPr/>
+      </w:pPr>
+      <w:r>
+        <w:rPr/>
+        <w:t>3. Розробити програмне забезпечення для вирішення однієї з задач комп’ютерного зору (розпізнавання зображень, пошуку об’єктів на графічних зображеннях та ін.).</w:t>
+      </w:r>
+    </w:p>
+    <w:p>
+      <w:pPr>
+        <w:pStyle w:val="p11"/>
+        <w:rPr/>
+      </w:pPr>
+      <w:r>
+        <w:rPr/>
+        <w:t>3.1. Для створення програмного забезпечення обрати мову програмування та інші засоби розробки (програмні бібліотеки та ін.). Студент не обмежується у виборі мови програмування та інших засобів розробки програмного забезпечення.</w:t>
+      </w:r>
+    </w:p>
+    <w:p>
+      <w:pPr>
+        <w:pStyle w:val="p11"/>
+        <w:rPr/>
+      </w:pPr>
+      <w:r>
+        <w:rPr/>
+        <w:t>3.2. Проаналізувати обрані вхідні дані та предметну область, визначити вимоги до програмного забезпечення (формати подання вхідних даних, необхідність попередньої обробки даних, необхідність поділу множини даних на навчальну та тестову вибірки даних, використовувані математичні моделі для обробки зображень, необхідність подання результатів у вигляді графіків та ін.).</w:t>
+      </w:r>
+    </w:p>
+    <w:p>
+      <w:pPr>
+        <w:pStyle w:val="p11"/>
+        <w:rPr/>
+      </w:pPr>
+      <w:r>
+        <w:rPr/>
+        <w:t>3.3. Здійснити проєктування архітектури програмного забезпечення для обробки зображень.</w:t>
+      </w:r>
+    </w:p>
+    <w:p>
+      <w:pPr>
+        <w:pStyle w:val="p11"/>
+        <w:rPr/>
+      </w:pPr>
+      <w:r>
+        <w:rPr/>
+        <w:t>3.4. Виконати конструювання програмного забезпечення.</w:t>
+      </w:r>
+    </w:p>
+    <w:p>
+      <w:pPr>
+        <w:pStyle w:val="p11"/>
+        <w:rPr/>
+      </w:pPr>
+      <w:r>
+        <w:rPr/>
+        <w:t>3.5. Виконати тестування розробленого програмного забезпечення. Подати результати тестування розробленого програмного забезпечення для обробки зображень у зручному для подальшого аналізу вигляді.</w:t>
+      </w:r>
+    </w:p>
+    <w:p>
+      <w:pPr>
+        <w:pStyle w:val="p11"/>
+        <w:rPr/>
+      </w:pPr>
+      <w:r>
+        <w:rPr/>
         <w:t xml:space="preserve">4. Зробити висновки за роботою. </w:t>
       </w:r>
     </w:p>
@@ -544,24 +692,20 @@
       </w:pPr>
       <w:r>
         <w:rPr/>
-        <w:t>Під час прочитання методичних вказівок виникали такі питання:</w:t>
-      </w:r>
-    </w:p>
-    <w:p>
-      <w:pPr>
-        <w:pStyle w:val="p11"/>
-        <w:rPr/>
-      </w:pPr>
-      <w:r>
-        <w:rPr/>
-        <w:t xml:space="preserve">- </w:t>
-      </w:r>
-      <w:r>
-        <w:rPr>
-          <w:b/>
-          <w:bCs/>
-        </w:rPr>
-        <w:t>що означає мегапіксель? Що означає «мега»?</w:t>
+        <w:t>Під час читання методичних вказівок виникали такі питання:</w:t>
+      </w:r>
+    </w:p>
+    <w:p>
+      <w:pPr>
+        <w:pStyle w:val="p11"/>
+        <w:rPr/>
+      </w:pPr>
+      <w:r>
+        <w:rPr>
+          <w:b/>
+          <w:bCs/>
+        </w:rPr>
+        <w:t>Що означає мегапіксель? Що означає «мега»?</w:t>
       </w:r>
       <w:r>
         <w:rPr/>
@@ -594,7 +738,7 @@
       </w:r>
       <w:r>
         <w:rPr>
-          <w:rFonts w:eastAsia="Times New Roman" w:cs="Times New Roman" w:ascii="Times New Roman" w:hAnsi="Times New Roman"/>
+          <w:rFonts w:eastAsia="Times New Roman" w:cs="Times New Roman"/>
           <w:position w:val="0"/>
           <w:sz w:val="28"/>
           <w:vertAlign w:val="baseline"/>
@@ -629,7 +773,7 @@
       </w:r>
       <w:r>
         <w:rPr>
-          <w:rFonts w:eastAsia="Times New Roman" w:cs="Times New Roman" w:ascii="Times New Roman" w:hAnsi="Times New Roman"/>
+          <w:rFonts w:eastAsia="Times New Roman" w:cs="Times New Roman"/>
           <w:position w:val="0"/>
           <w:sz w:val="28"/>
           <w:vertAlign w:val="baseline"/>
@@ -681,17 +825,11 @@
       </w:pPr>
       <w:r>
         <w:rPr>
-          <w:lang w:val="uk-UA"/>
-        </w:rPr>
-        <w:t xml:space="preserve">- </w:t>
-      </w:r>
-      <w:r>
-        <w:rPr>
-          <w:b/>
-          <w:bCs/>
-          <w:lang w:val="uk-UA"/>
-        </w:rPr>
-        <w:t xml:space="preserve">що таке піксель? Як вони зберігаються? Що таке </w:t>
+          <w:b/>
+          <w:bCs/>
+          <w:lang w:val="uk-UA"/>
+        </w:rPr>
+        <w:t xml:space="preserve">Що таке піксель? Як вони зберігаються? Що таке </w:t>
       </w:r>
       <w:r>
         <w:rPr>
@@ -737,17 +875,11 @@
       </w:pPr>
       <w:r>
         <w:rPr>
-          <w:lang w:val="uk-UA"/>
-        </w:rPr>
-        <w:t xml:space="preserve">- </w:t>
-      </w:r>
-      <w:r>
-        <w:rPr>
-          <w:b/>
-          <w:bCs/>
-          <w:lang w:val="uk-UA"/>
-        </w:rPr>
-        <w:t xml:space="preserve">що таке біти? Як їх рахувати? Що таке байти? </w:t>
+          <w:b/>
+          <w:bCs/>
+          <w:lang w:val="uk-UA"/>
+        </w:rPr>
+        <w:t xml:space="preserve">Що таке біти? Як їх рахувати? Що таке байти? </w:t>
       </w:r>
       <w:r>
         <w:rPr>
@@ -765,17 +897,11 @@
       </w:pPr>
       <w:r>
         <w:rPr>
-          <w:lang w:val="uk-UA"/>
-        </w:rPr>
-        <w:t xml:space="preserve">- </w:t>
-      </w:r>
-      <w:r>
-        <w:rPr>
-          <w:b/>
-          <w:bCs/>
-          <w:lang w:val="uk-UA"/>
-        </w:rPr>
-        <w:t>що таке двійкова система? Чому в ній 1000 не є тисячею, але 1024?</w:t>
+          <w:b/>
+          <w:bCs/>
+          <w:lang w:val="uk-UA"/>
+        </w:rPr>
+        <w:t>Що таке двійкова система? Чому в ній 1000 не є тисячею, але 1024?</w:t>
       </w:r>
       <w:r>
         <w:rPr>
@@ -821,21 +947,213 @@
       </w:pPr>
       <w:r>
         <w:rPr>
-          <w:lang w:val="uk-UA"/>
-        </w:rPr>
-        <w:t xml:space="preserve">- </w:t>
-      </w:r>
-      <w:r>
-        <w:rPr>
-          <w:b/>
-          <w:bCs/>
-          <w:lang w:val="uk-UA"/>
-        </w:rPr>
-        <w:t>що таке растрова графіка? Що таке векторна графіка? Як дані зберігаються для обидвох?</w:t>
-      </w:r>
-      <w:r>
-        <w:rPr>
-          <w:lang w:val="uk-UA"/>
+          <w:b/>
+          <w:bCs/>
+          <w:lang w:val="uk-UA"/>
+        </w:rPr>
+        <w:t>Що таке растрова графіка? Що таке векторна графіка? Як дані зберігаються для обидвох?</w:t>
+      </w:r>
+      <w:r>
+        <w:rPr>
+          <w:lang w:val="uk-UA"/>
+        </w:rPr>
+        <w:t xml:space="preserve"> Растрова графіка це спосіб представлення зображення, що зберігає зображення як сітку пікселів. Кожен піксель тут має величину кольору (якщо це </w:t>
+      </w:r>
+      <w:r>
+        <w:rPr>
+          <w:lang w:val="en-US"/>
+        </w:rPr>
+        <w:t xml:space="preserve">RGB, </w:t>
+      </w:r>
+      <w:r>
+        <w:rPr>
+          <w:lang w:val="uk-UA"/>
+        </w:rPr>
+        <w:t xml:space="preserve">то 3 величини кольору для кожного пікселя). Векторна графіка використовує математичні формули для побудови зображення. </w:t>
+      </w:r>
+    </w:p>
+    <w:p>
+      <w:pPr>
+        <w:pStyle w:val="p11"/>
+        <w:rPr>
+          <w:lang w:val="uk-UA"/>
+        </w:rPr>
+      </w:pPr>
+      <w:r>
+        <w:rPr>
+          <w:b/>
+          <w:bCs/>
+          <w:lang w:val="uk-UA"/>
+        </w:rPr>
+        <w:t>Що таке бітова мапа? Що таке растр?</w:t>
+      </w:r>
+      <w:r>
+        <w:rPr>
+          <w:lang w:val="uk-UA"/>
+        </w:rPr>
+        <w:t xml:space="preserve"> Растр це просто сітка з пікселями та їх значеннями, частіше у форматі </w:t>
+      </w:r>
+      <w:r>
+        <w:rPr>
+          <w:lang w:val="en-US"/>
+        </w:rPr>
+        <w:t xml:space="preserve">RGB. </w:t>
+      </w:r>
+      <w:r>
+        <w:rPr>
+          <w:lang w:val="uk-UA"/>
+        </w:rPr>
+        <w:t>Бітова мапа це така ж сітка пікселів, тільки у бітовому форматі.</w:t>
+      </w:r>
+    </w:p>
+    <w:p>
+      <w:pPr>
+        <w:pStyle w:val="p11"/>
+        <w:rPr>
+          <w:lang w:val="uk-UA"/>
+        </w:rPr>
+      </w:pPr>
+      <w:r>
+        <w:rPr>
+          <w:b/>
+          <w:bCs/>
+          <w:lang w:val="uk-UA"/>
+        </w:rPr>
+        <w:t>Що таке стискання файлу?</w:t>
+      </w:r>
+      <w:r>
+        <w:rPr>
+          <w:lang w:val="uk-UA"/>
+        </w:rPr>
+        <w:t xml:space="preserve"> Це зменшення повторюваних елементів у зображенні для зменшення розміру файлу. Стискання буває без втрат (</w:t>
+      </w:r>
+      <w:r>
+        <w:rPr>
+          <w:lang w:val="en-US"/>
+        </w:rPr>
+        <w:t xml:space="preserve">lossless) </w:t>
+      </w:r>
+      <w:r>
+        <w:rPr>
+          <w:lang w:val="uk-UA"/>
+        </w:rPr>
+        <w:t xml:space="preserve">та з втратами </w:t>
+      </w:r>
+      <w:r>
+        <w:rPr>
+          <w:lang w:val="en-US"/>
+        </w:rPr>
+        <w:t>(lossy).</w:t>
+      </w:r>
+    </w:p>
+    <w:p>
+      <w:pPr>
+        <w:pStyle w:val="p11"/>
+        <w:rPr>
+          <w:lang w:val="en-US"/>
+        </w:rPr>
+      </w:pPr>
+      <w:r>
+        <w:rPr>
+          <w:b/>
+          <w:bCs/>
+          <w:lang w:val="uk-UA"/>
+        </w:rPr>
+        <w:t xml:space="preserve">Що таке тензор? Що означає </w:t>
+      </w:r>
+      <w:r>
+        <w:rPr>
+          <w:b/>
+          <w:bCs/>
+          <w:lang w:val="en-US"/>
+        </w:rPr>
+        <w:t xml:space="preserve">TensorFlow? </w:t>
+      </w:r>
+      <w:r>
+        <w:rPr>
+          <w:lang w:val="uk-UA"/>
+        </w:rPr>
+        <w:t xml:space="preserve">Тензор це спосіб збереження даних, які можуть містити багато вимірів. </w:t>
+      </w:r>
+      <w:r>
+        <w:rPr>
+          <w:lang w:val="en-US"/>
+        </w:rPr>
+        <w:t xml:space="preserve">TensorFlow </w:t>
+      </w:r>
+      <w:r>
+        <w:rPr>
+          <w:lang w:val="uk-UA"/>
+        </w:rPr>
+        <w:t>означає потік тензорів (</w:t>
+      </w:r>
+      <w:r>
+        <w:rPr>
+          <w:lang w:val="en-US"/>
+        </w:rPr>
+        <w:t>a flow of tensors).</w:t>
+      </w:r>
+    </w:p>
+    <w:p>
+      <w:pPr>
+        <w:pStyle w:val="p11"/>
+        <w:rPr>
+          <w:lang w:val="en-US"/>
+        </w:rPr>
+      </w:pPr>
+      <w:r>
+        <w:rPr>
+          <w:b/>
+          <w:bCs/>
+          <w:lang w:val="uk-UA"/>
+        </w:rPr>
+        <w:t xml:space="preserve">Як працює </w:t>
+      </w:r>
+      <w:r>
+        <w:rPr>
+          <w:b/>
+          <w:bCs/>
+          <w:lang w:val="en-US"/>
+        </w:rPr>
+        <w:t xml:space="preserve">ReLU? </w:t>
+      </w:r>
+      <w:r>
+        <w:rPr>
+          <w:lang w:val="uk-UA"/>
+        </w:rPr>
+        <w:t xml:space="preserve">За формулою </w:t>
+      </w:r>
+      <w:r>
+        <w:rPr>
+          <w:i/>
+          <w:iCs/>
+          <w:lang w:val="en-US"/>
+        </w:rPr>
+        <w:t>f(n) = max(0, n)</w:t>
+      </w:r>
+      <w:r>
+        <w:rPr>
+          <w:lang w:val="en-US"/>
+        </w:rPr>
+        <w:t xml:space="preserve">, </w:t>
+      </w:r>
+      <w:r>
+        <w:rPr>
+          <w:lang w:val="uk-UA"/>
+        </w:rPr>
+        <w:t xml:space="preserve">де </w:t>
+      </w:r>
+      <w:r>
+        <w:rPr>
+          <w:i/>
+          <w:iCs/>
+          <w:lang w:val="en-US"/>
+        </w:rPr>
+        <w:t>n</w:t>
+      </w:r>
+      <w:r>
+        <w:rPr>
+          <w:lang w:val="en-US"/>
         </w:rPr>
         <w:t xml:space="preserve"> </w:t>
       </w:r>
@@ -843,324 +1161,903 @@
         <w:rPr>
           <w:lang w:val="uk-UA"/>
         </w:rPr>
-        <w:t xml:space="preserve">Растрова графіка це спосіб представлення зображення, що зберігає зображення як сітку пікселів. Кожен піксель тут має величину кольору (якщо це </w:t>
-      </w:r>
-      <w:r>
-        <w:rPr>
-          <w:lang w:val="en-US"/>
-        </w:rPr>
-        <w:t xml:space="preserve">RGB, </w:t>
-      </w:r>
-      <w:r>
-        <w:rPr>
-          <w:lang w:val="uk-UA"/>
-        </w:rPr>
-        <w:t xml:space="preserve">то 3 величини кольору для кожного пікселя). Векторна графіка використовує математичні формули для побудови зображення. </w:t>
-      </w:r>
-    </w:p>
-    <w:p>
-      <w:pPr>
-        <w:pStyle w:val="p11"/>
-        <w:rPr>
-          <w:lang w:val="uk-UA"/>
-        </w:rPr>
-      </w:pPr>
-      <w:r>
-        <w:rPr>
-          <w:lang w:val="uk-UA"/>
-        </w:rPr>
-        <w:t xml:space="preserve">- </w:t>
-      </w:r>
-      <w:r>
-        <w:rPr>
-          <w:b/>
-          <w:bCs/>
-          <w:lang w:val="uk-UA"/>
-        </w:rPr>
-        <w:t>що таке бітова мапа? Що таке растр?</w:t>
-      </w:r>
-      <w:r>
-        <w:rPr>
-          <w:lang w:val="uk-UA"/>
-        </w:rPr>
-        <w:t xml:space="preserve"> </w:t>
-      </w:r>
-      <w:r>
-        <w:rPr>
-          <w:lang w:val="uk-UA"/>
-        </w:rPr>
-        <w:t xml:space="preserve">Растр це просто сітка з пікселями та їх значеннями, частіше у форматі </w:t>
-      </w:r>
-      <w:r>
-        <w:rPr>
-          <w:lang w:val="en-US"/>
-        </w:rPr>
-        <w:t xml:space="preserve">RGB. </w:t>
-      </w:r>
-      <w:r>
-        <w:rPr>
-          <w:lang w:val="uk-UA"/>
-        </w:rPr>
-        <w:t>Бітова мапа це така ж сітка пікселів, тільки у бітовому форматі.</w:t>
-      </w:r>
-    </w:p>
-    <w:p>
-      <w:pPr>
-        <w:pStyle w:val="p11"/>
-        <w:rPr>
-          <w:lang w:val="uk-UA"/>
-        </w:rPr>
-      </w:pPr>
-      <w:r>
-        <w:rPr>
-          <w:lang w:val="uk-UA"/>
-        </w:rPr>
-        <w:t xml:space="preserve">- </w:t>
-      </w:r>
-      <w:r>
-        <w:rPr>
-          <w:b/>
-          <w:bCs/>
-          <w:lang w:val="uk-UA"/>
-        </w:rPr>
-        <w:t>що таке стискання файлу?</w:t>
-      </w:r>
-      <w:r>
-        <w:rPr>
-          <w:lang w:val="uk-UA"/>
-        </w:rPr>
-        <w:t xml:space="preserve"> </w:t>
-      </w:r>
-      <w:r>
-        <w:rPr>
-          <w:lang w:val="uk-UA"/>
-        </w:rPr>
-        <w:t>Це зменшення повторюваних елементів у зображенні для зменшення розміру файлу. Стискання буває без втрат (</w:t>
-      </w:r>
-      <w:r>
-        <w:rPr>
-          <w:lang w:val="en-US"/>
-        </w:rPr>
-        <w:t xml:space="preserve">lossless) </w:t>
-      </w:r>
-      <w:r>
-        <w:rPr>
-          <w:lang w:val="uk-UA"/>
-        </w:rPr>
-        <w:t xml:space="preserve">та з втратами </w:t>
-      </w:r>
-      <w:r>
-        <w:rPr>
-          <w:lang w:val="en-US"/>
-        </w:rPr>
-        <w:t>(lossy).</w:t>
-      </w:r>
-    </w:p>
-    <w:p>
-      <w:pPr>
-        <w:pStyle w:val="p11"/>
-        <w:rPr>
-          <w:lang w:val="en-US"/>
-        </w:rPr>
-      </w:pPr>
-      <w:r>
-        <w:rPr>
-          <w:lang w:val="en-US"/>
-        </w:rPr>
-        <w:t xml:space="preserve">- </w:t>
-      </w:r>
-      <w:r>
-        <w:rPr>
-          <w:b/>
-          <w:bCs/>
-          <w:lang w:val="uk-UA"/>
-        </w:rPr>
-        <w:t xml:space="preserve">що таке тензор? Що означає </w:t>
-      </w:r>
-      <w:r>
-        <w:rPr>
-          <w:b/>
-          <w:bCs/>
-          <w:lang w:val="en-US"/>
-        </w:rPr>
-        <w:t xml:space="preserve">TensorFlow? </w:t>
-      </w:r>
-      <w:r>
-        <w:rPr>
-          <w:lang w:val="uk-UA"/>
-        </w:rPr>
-        <w:t xml:space="preserve">Тензор це спосіб збереження даних, які можуть містити багато вимірів. </w:t>
-      </w:r>
-      <w:r>
-        <w:rPr>
-          <w:lang w:val="en-US"/>
-        </w:rPr>
-        <w:t xml:space="preserve">TensorFlow </w:t>
-      </w:r>
-      <w:r>
-        <w:rPr>
-          <w:lang w:val="uk-UA"/>
-        </w:rPr>
-        <w:t>означає потік тензорів (</w:t>
-      </w:r>
-      <w:r>
-        <w:rPr>
-          <w:lang w:val="en-US"/>
-        </w:rPr>
-        <w:t>a flow of tensors).</w:t>
-      </w:r>
-    </w:p>
-    <w:p>
-      <w:pPr>
-        <w:pStyle w:val="p11"/>
-        <w:rPr>
-          <w:lang w:val="uk-UA"/>
-        </w:rPr>
-      </w:pPr>
-      <w:r>
-        <w:rPr>
-          <w:lang w:val="uk-UA"/>
-        </w:rPr>
-      </w:r>
-    </w:p>
-    <w:p>
-      <w:pPr>
-        <w:pStyle w:val="h11"/>
-        <w:rPr/>
-      </w:pPr>
-      <w:r>
-        <w:rPr/>
-        <w:t>Висновки</w:t>
-      </w:r>
-    </w:p>
-    <w:p>
-      <w:pPr>
-        <w:pStyle w:val="p11"/>
-        <w:rPr/>
-      </w:pPr>
-      <w:r>
-        <w:rPr/>
-      </w:r>
-    </w:p>
-    <w:p>
-      <w:pPr>
-        <w:pStyle w:val="p11"/>
-        <w:rPr/>
-      </w:pPr>
-      <w:r>
-        <w:rPr/>
-        <w:t>Отже, було навчено реалізовувати програмні проєкти у сфері інженерії програмного забезпечення, пов’язані з необхідністю обробки часових послідовностей даних.</w:t>
-      </w:r>
-    </w:p>
-    <w:p>
-      <w:pPr>
-        <w:pStyle w:val="p11"/>
-        <w:rPr/>
-      </w:pPr>
-      <w:r>
-        <w:rPr/>
-        <w:t>Під час виконання роботи виникли такі питання:</w:t>
-      </w:r>
-    </w:p>
-    <w:p>
-      <w:pPr>
-        <w:pStyle w:val="p11"/>
-        <w:rPr/>
-      </w:pPr>
-      <w:r>
-        <w:rPr/>
-      </w:r>
-    </w:p>
-    <w:p>
-      <w:pPr>
-        <w:pStyle w:val="H2"/>
+        <w:t>це вхідні дані. Тобто ReLU прибирає всі від’ємні значення.</w:t>
+      </w:r>
+    </w:p>
+    <w:p>
+      <w:pPr>
+        <w:pStyle w:val="p11"/>
         <w:rPr>
           <w:b w:val="false"/>
           <w:bCs w:val="false"/>
+          <w:lang w:val="uk-UA"/>
+        </w:rPr>
+      </w:pPr>
+      <w:r>
+        <w:rPr>
+          <w:b/>
+          <w:bCs/>
+          <w:lang w:val="uk-UA"/>
+        </w:rPr>
+        <w:t xml:space="preserve">Для чого створюється менший стек відфільтрованих зображень у </w:t>
+      </w:r>
+      <w:r>
+        <w:rPr>
+          <w:b/>
+          <w:bCs/>
+          <w:lang w:val="en-US"/>
+        </w:rPr>
+        <w:t>CNN?</w:t>
+      </w:r>
+      <w:r>
+        <w:rPr>
+          <w:b w:val="false"/>
+          <w:bCs w:val="false"/>
+          <w:lang w:val="en-US"/>
+        </w:rPr>
+        <w:t xml:space="preserve"> </w:t>
+      </w:r>
+      <w:r>
+        <w:rPr>
+          <w:b w:val="false"/>
+          <w:bCs w:val="false"/>
+          <w:lang w:val="uk-UA"/>
+        </w:rPr>
+        <w:t>Через процес створення мапи ознак (</w:t>
+      </w:r>
+      <w:r>
+        <w:rPr>
+          <w:b w:val="false"/>
+          <w:bCs w:val="false"/>
+          <w:lang w:val="en-US"/>
+        </w:rPr>
+        <w:t xml:space="preserve">features map). </w:t>
+      </w:r>
+      <w:r>
+        <w:rPr>
+          <w:b w:val="false"/>
+          <w:bCs w:val="false"/>
+          <w:lang w:val="uk-UA"/>
+        </w:rPr>
+        <w:t>Фільтр проходиться по зображенню і від кожного кроку створює одне значення.</w:t>
+      </w:r>
+    </w:p>
+    <w:p>
+      <w:pPr>
+        <w:pStyle w:val="p11"/>
+        <w:rPr>
+          <w:lang w:val="uk-UA"/>
+        </w:rPr>
+      </w:pPr>
+      <w:r>
+        <w:rPr>
+          <w:b/>
+          <w:bCs/>
+          <w:lang w:val="uk-UA"/>
+        </w:rPr>
+        <w:t>З яких шарів складається Convolutional</w:t>
+      </w:r>
+      <w:r>
+        <w:rPr>
+          <w:b/>
+          <w:bCs/>
+          <w:lang w:val="en-US"/>
+        </w:rPr>
+        <w:t xml:space="preserve"> Neural Network? </w:t>
+      </w:r>
+      <w:r>
+        <w:rPr>
+          <w:b/>
+          <w:bCs/>
+          <w:lang w:val="uk-UA"/>
+        </w:rPr>
+        <w:t xml:space="preserve">Що означає кожний? </w:t>
+      </w:r>
+      <w:r>
+        <w:rPr>
+          <w:lang w:val="uk-UA"/>
+        </w:rPr>
+        <w:t xml:space="preserve">Convolutional Neural Network складається з шарів </w:t>
+      </w:r>
+      <w:r>
+        <w:rPr>
+          <w:lang w:val="en-US"/>
+        </w:rPr>
+        <w:t xml:space="preserve">convolutional, ReLU, pooling </w:t>
+      </w:r>
+      <w:r>
+        <w:rPr>
+          <w:lang w:val="uk-UA"/>
+        </w:rPr>
+        <w:t xml:space="preserve">та </w:t>
+      </w:r>
+      <w:r>
+        <w:rPr>
+          <w:lang w:val="en-US"/>
+        </w:rPr>
+        <w:t xml:space="preserve">fully connected. </w:t>
+      </w:r>
+      <w:r>
+        <w:fldChar w:fldCharType="begin"/>
+      </w:r>
+      <w:r>
+        <w:rPr>
+          <w:rStyle w:val="Hyperlink"/>
+          <w:lang w:val="uk-UA"/>
+        </w:rPr>
+        <w:instrText xml:space="preserve"> HYPERLINK "https://medium.com/dataman-in-ai/module-6-image-recognition-for-insurance-claim-handling-part-i-a338d16c9de0" \l ":~:text=There%20are%20four%20types%20of%20layers%3A%20the%20convolution%2C%20the%20ReLUs%2C%20the%20pooling%2C%20and%20the%20fully%20connected%20layers"</w:instrText>
+      </w:r>
+      <w:r>
+        <w:rPr>
+          <w:rStyle w:val="Hyperlink"/>
+          <w:lang w:val="uk-UA"/>
+        </w:rPr>
+        <w:fldChar w:fldCharType="separate"/>
+      </w:r>
+      <w:r>
+        <w:rPr>
+          <w:rStyle w:val="Hyperlink"/>
+          <w:lang w:val="uk-UA"/>
+        </w:rPr>
+        <w:t>Джерело</w:t>
+      </w:r>
+      <w:r>
+        <w:rPr>
+          <w:rStyle w:val="Hyperlink"/>
+          <w:lang w:val="uk-UA"/>
+        </w:rPr>
+        <w:fldChar w:fldCharType="end"/>
+      </w:r>
+      <w:r>
+        <w:rPr>
+          <w:lang w:val="uk-UA"/>
+        </w:rPr>
+        <w:t>.</w:t>
+      </w:r>
+    </w:p>
+    <w:p>
+      <w:pPr>
+        <w:pStyle w:val="p11"/>
+        <w:rPr>
+          <w:lang w:val="uk-UA"/>
+        </w:rPr>
+      </w:pPr>
+      <w:r>
+        <w:rPr>
+          <w:b/>
+          <w:bCs/>
+          <w:lang w:val="uk-UA"/>
+        </w:rPr>
+        <w:t xml:space="preserve">Що таке фільтр у </w:t>
+      </w:r>
+      <w:r>
+        <w:rPr>
+          <w:b/>
+          <w:bCs/>
+          <w:lang w:val="en-US"/>
+        </w:rPr>
+        <w:t xml:space="preserve">CNN </w:t>
+      </w:r>
+      <w:r>
+        <w:rPr>
+          <w:b/>
+          <w:bCs/>
+          <w:lang w:val="uk-UA"/>
+        </w:rPr>
+        <w:t xml:space="preserve">і як він генерується? </w:t>
+      </w:r>
+      <w:r>
+        <w:rPr>
+          <w:lang w:val="uk-UA"/>
+        </w:rPr>
+        <w:t xml:space="preserve">Фільтр це така собі маска, яка накладається на зображення. Нагадує алгоритм </w:t>
+      </w:r>
+      <w:r>
+        <w:rPr>
           <w:i/>
           <w:iCs/>
-        </w:rPr>
-      </w:pPr>
-      <w:r>
-        <w:rPr>
-          <w:b w:val="false"/>
-          <w:bCs w:val="false"/>
+          <w:lang w:val="en-US"/>
+        </w:rPr>
+        <w:t>sliding window</w:t>
+      </w:r>
+      <w:r>
+        <w:rPr>
+          <w:lang w:val="en-US"/>
+        </w:rPr>
+        <w:t xml:space="preserve">. </w:t>
+      </w:r>
+      <w:r>
+        <w:rPr>
+          <w:lang w:val="uk-UA"/>
+        </w:rPr>
+        <w:t xml:space="preserve">Спочатку кожне значення обирається випадковим чином. Далі через </w:t>
+      </w:r>
+      <w:r>
+        <w:rPr>
+          <w:lang w:val="en-US"/>
+        </w:rPr>
+        <w:t xml:space="preserve">backpropagation </w:t>
+      </w:r>
+      <w:r>
+        <w:rPr>
+          <w:lang w:val="uk-UA"/>
+        </w:rPr>
+        <w:t xml:space="preserve">та </w:t>
+      </w:r>
+      <w:r>
+        <w:rPr>
+          <w:lang w:val="en-US"/>
+        </w:rPr>
+        <w:t xml:space="preserve">gradient descent </w:t>
+      </w:r>
+      <w:r>
+        <w:rPr>
+          <w:lang w:val="uk-UA"/>
+        </w:rPr>
+        <w:t>значення змінюються.</w:t>
+      </w:r>
+    </w:p>
+    <w:p>
+      <w:pPr>
+        <w:pStyle w:val="p11"/>
+        <w:rPr>
+          <w:lang w:val="uk-UA"/>
+        </w:rPr>
+      </w:pPr>
+      <w:r>
+        <w:rPr>
+          <w:b/>
+          <w:bCs/>
+          <w:lang w:val="uk-UA"/>
+        </w:rPr>
+        <w:t xml:space="preserve">Звідки береться початковий розмір фільтру? </w:t>
+      </w:r>
+      <w:r>
+        <w:rPr>
+          <w:lang w:val="uk-UA"/>
+        </w:rPr>
+        <w:t xml:space="preserve">Значення розміру фільтру (Англійською </w:t>
+      </w:r>
+      <w:r>
+        <w:rPr>
           <w:i/>
           <w:iCs/>
-        </w:rPr>
-        <w:t xml:space="preserve">Що означають рядки, що починаються з </w:t>
-      </w:r>
-      <w:r>
-        <w:rPr>
-          <w:b w:val="false"/>
-          <w:bCs w:val="false"/>
-          <w:i/>
-          <w:iCs/>
-          <w:lang w:val="en-US"/>
-        </w:rPr>
-        <w:t>ARIMA?</w:t>
+          <w:lang w:val="en-US"/>
+        </w:rPr>
+        <w:t>kernel</w:t>
+      </w:r>
+      <w:r>
+        <w:rPr>
+          <w:lang w:val="en-US"/>
+        </w:rPr>
+        <w:t xml:space="preserve">) </w:t>
+      </w:r>
+      <w:r>
+        <w:rPr>
+          <w:lang w:val="uk-UA"/>
+        </w:rPr>
+        <w:t>визначається розробником на початку роботи.</w:t>
+      </w:r>
+    </w:p>
+    <w:p>
+      <w:pPr>
+        <w:pStyle w:val="p11"/>
+        <w:rPr>
+          <w:lang w:val="uk-UA"/>
+        </w:rPr>
+      </w:pPr>
+      <w:r>
+        <w:rPr>
+          <w:b/>
+          <w:bCs/>
+          <w:lang w:val="uk-UA"/>
+        </w:rPr>
+        <w:t>Що таке випадковість? Звідки вона береться?</w:t>
+      </w:r>
+      <w:r>
+        <w:rPr>
+          <w:lang w:val="uk-UA"/>
+        </w:rPr>
+        <w:t xml:space="preserve"> Все контролює Господь Бог, випадковості немає. Але є псевдовипадковість. Це коли комп’ютер генерує певні числа і видає їх користувачеві.</w:t>
+      </w:r>
+    </w:p>
+    <w:p>
+      <w:pPr>
+        <w:pStyle w:val="p11"/>
+        <w:rPr>
+          <w:lang w:val="uk-UA"/>
+        </w:rPr>
+      </w:pPr>
+      <w:r>
+        <w:rPr>
+          <w:b/>
+          <w:bCs/>
+          <w:lang w:val="uk-UA"/>
+        </w:rPr>
+        <w:t xml:space="preserve">Що таке </w:t>
+      </w:r>
+      <w:r>
+        <w:rPr>
+          <w:b/>
+          <w:bCs/>
+          <w:lang w:val="en-US"/>
+        </w:rPr>
+        <w:t xml:space="preserve">seed </w:t>
+      </w:r>
+      <w:r>
+        <w:rPr>
+          <w:b/>
+          <w:bCs/>
+          <w:lang w:val="uk-UA"/>
+        </w:rPr>
+        <w:t xml:space="preserve">у псевдовипадковості? </w:t>
+      </w:r>
+      <w:r>
+        <w:rPr>
+          <w:lang w:val="uk-UA"/>
+        </w:rPr>
+        <w:t xml:space="preserve">Це така собі стартова точка. Якщо </w:t>
+      </w:r>
+      <w:r>
+        <w:rPr>
+          <w:lang w:val="en-US"/>
+        </w:rPr>
+        <w:t xml:space="preserve">seed </w:t>
+      </w:r>
+      <w:r>
+        <w:rPr>
+          <w:lang w:val="uk-UA"/>
+        </w:rPr>
+        <w:t>однаковий, згенеровані псевдовипадкові дані також будуть однакові.</w:t>
+      </w:r>
+    </w:p>
+    <w:p>
+      <w:pPr>
+        <w:pStyle w:val="p11"/>
+        <w:rPr>
+          <w:lang w:val="uk-UA"/>
+        </w:rPr>
+      </w:pPr>
+      <w:r>
+        <w:rPr>
+          <w:b/>
+          <w:bCs/>
+          <w:lang w:val="uk-UA"/>
+        </w:rPr>
+        <w:t xml:space="preserve">Що таке алгоритм </w:t>
+      </w:r>
+      <w:r>
+        <w:rPr>
+          <w:b/>
+          <w:bCs/>
+          <w:lang w:val="en-US"/>
+        </w:rPr>
+        <w:t>PRNG?</w:t>
+      </w:r>
+      <w:r>
+        <w:rPr>
+          <w:lang w:val="en-US"/>
+        </w:rPr>
+        <w:t xml:space="preserve"> </w:t>
+      </w:r>
+      <w:r>
+        <w:rPr>
+          <w:lang w:val="uk-UA"/>
+        </w:rPr>
+        <w:t xml:space="preserve">Алгоритм </w:t>
+      </w:r>
+      <w:r>
+        <w:rPr>
+          <w:lang w:val="en-US"/>
+        </w:rPr>
+        <w:t xml:space="preserve">PRNG </w:t>
+      </w:r>
+      <w:r>
+        <w:rPr>
+          <w:lang w:val="uk-UA"/>
+        </w:rPr>
+        <w:t xml:space="preserve">розшифовується як </w:t>
+      </w:r>
+      <w:r>
+        <w:rPr>
+          <w:lang w:val="en-US"/>
+        </w:rPr>
+        <w:t>Pseudo Random Number Generator (</w:t>
+      </w:r>
+      <w:r>
+        <w:rPr>
+          <w:lang w:val="uk-UA"/>
+        </w:rPr>
+        <w:t>генератор псевдовипадкових чисел).</w:t>
+      </w:r>
+    </w:p>
+    <w:p>
+      <w:pPr>
+        <w:pStyle w:val="p11"/>
+        <w:rPr>
+          <w:lang w:val="uk-UA"/>
+        </w:rPr>
+      </w:pPr>
+      <w:r>
+        <w:rPr>
+          <w:b/>
+          <w:bCs/>
+          <w:lang w:val="uk-UA"/>
+        </w:rPr>
+        <w:t xml:space="preserve">Що таке натяжіння у фізиці? </w:t>
+      </w:r>
+      <w:r>
+        <w:rPr>
+          <w:lang w:val="uk-UA"/>
+        </w:rPr>
+        <w:t>Це прагнення рідини скоротити свою площу.</w:t>
+      </w:r>
+    </w:p>
+    <w:p>
+      <w:pPr>
+        <w:pStyle w:val="p11"/>
+        <w:rPr>
+          <w:lang w:val="uk-UA"/>
+        </w:rPr>
+      </w:pPr>
+      <w:r>
+        <w:rPr>
+          <w:lang w:val="uk-UA"/>
+        </w:rPr>
+        <w:t xml:space="preserve">Що таке </w:t>
+      </w:r>
+      <w:r>
+        <w:rPr>
+          <w:lang w:val="en-US"/>
+        </w:rPr>
+        <w:t xml:space="preserve">finite automata? </w:t>
+      </w:r>
+    </w:p>
+    <w:p>
+      <w:pPr>
+        <w:pStyle w:val="p11"/>
+        <w:rPr>
+          <w:lang w:val="uk-UA"/>
+        </w:rPr>
+      </w:pPr>
+      <w:r>
+        <w:rPr>
+          <w:lang w:val="uk-UA"/>
+        </w:rPr>
+        <w:t xml:space="preserve">В чому різниця між </w:t>
+      </w:r>
+      <w:r>
+        <w:rPr>
+          <w:lang w:val="en-US"/>
+        </w:rPr>
+        <w:t xml:space="preserve">DFA </w:t>
+      </w:r>
+      <w:r>
+        <w:rPr>
+          <w:lang w:val="uk-UA"/>
+        </w:rPr>
+        <w:t xml:space="preserve">та </w:t>
+      </w:r>
+      <w:r>
+        <w:rPr>
+          <w:lang w:val="en-US"/>
+        </w:rPr>
+        <w:t xml:space="preserve">NFA? </w:t>
+      </w:r>
+    </w:p>
+    <w:p>
+      <w:pPr>
+        <w:pStyle w:val="p11"/>
+        <w:rPr>
+          <w:lang w:val="uk-UA"/>
+        </w:rPr>
+      </w:pPr>
+      <w:r>
+        <w:rPr>
+          <w:lang w:val="uk-UA"/>
+        </w:rPr>
+        <w:t xml:space="preserve">Що таке машина станів? </w:t>
+      </w:r>
+    </w:p>
+    <w:p>
+      <w:pPr>
+        <w:pStyle w:val="p11"/>
+        <w:rPr>
+          <w:lang w:val="uk-UA"/>
+        </w:rPr>
+      </w:pPr>
+      <w:r>
+        <w:rPr>
+          <w:b/>
+          <w:bCs/>
+          <w:lang w:val="uk-UA"/>
+        </w:rPr>
+        <w:t xml:space="preserve">Що означає </w:t>
+      </w:r>
+      <w:r>
+        <w:rPr>
+          <w:b/>
+          <w:bCs/>
+          <w:lang w:val="en-US"/>
+        </w:rPr>
+        <w:t xml:space="preserve">deterministic </w:t>
+      </w:r>
+      <w:r>
+        <w:rPr>
+          <w:b/>
+          <w:bCs/>
+          <w:lang w:val="uk-UA"/>
+        </w:rPr>
+        <w:t xml:space="preserve">у теорії автоматів? </w:t>
+      </w:r>
+      <w:r>
+        <w:rPr>
+          <w:lang w:val="uk-UA"/>
+        </w:rPr>
+        <w:t>Це коли ми знаємо поточний стан і вхідні дані, ми точно можемо знати вихід.</w:t>
+      </w:r>
+    </w:p>
+    <w:p>
+      <w:pPr>
+        <w:pStyle w:val="p11"/>
+        <w:rPr>
+          <w:lang w:val="uk-UA"/>
+        </w:rPr>
+      </w:pPr>
+      <w:r>
+        <w:rPr>
+          <w:lang w:val="uk-UA"/>
+        </w:rPr>
+        <w:t>Де зберігаються дані програми під час її виконання? В оперативній пам’яті?</w:t>
+      </w:r>
+    </w:p>
+    <w:p>
+      <w:pPr>
+        <w:pStyle w:val="p11"/>
+        <w:rPr>
+          <w:lang w:val="uk-UA"/>
+        </w:rPr>
+      </w:pPr>
+      <w:r>
+        <w:rPr>
+          <w:lang w:val="uk-UA"/>
+        </w:rPr>
+        <w:t>Як працює оперативна пам’ять?</w:t>
+      </w:r>
+    </w:p>
+    <w:p>
+      <w:pPr>
+        <w:pStyle w:val="p11"/>
+        <w:rPr>
+          <w:lang w:val="uk-UA"/>
+        </w:rPr>
+      </w:pPr>
+      <w:r>
+        <w:rPr>
+          <w:lang w:val="uk-UA"/>
+        </w:rPr>
+        <w:t>Як оперативна пам’ять взаємодіє з процесором?</w:t>
+      </w:r>
+    </w:p>
+    <w:p>
+      <w:pPr>
+        <w:pStyle w:val="p11"/>
+        <w:rPr>
+          <w:lang w:val="uk-UA"/>
+        </w:rPr>
+      </w:pPr>
+      <w:r>
+        <w:rPr>
+          <w:lang w:val="uk-UA"/>
+        </w:rPr>
+        <w:t>Що робить процесор під час виконання програм?</w:t>
+      </w:r>
+    </w:p>
+    <w:p>
+      <w:pPr>
+        <w:pStyle w:val="p11"/>
+        <w:rPr>
+          <w:lang w:val="uk-UA"/>
+        </w:rPr>
+      </w:pPr>
+      <w:r>
+        <w:rPr>
+          <w:lang w:val="uk-UA"/>
+        </w:rPr>
+        <w:t>Що це за одне значення яке отримує програма під час застосування фільтру на кожному кроці?</w:t>
+      </w:r>
+    </w:p>
+    <w:p>
+      <w:pPr>
+        <w:pStyle w:val="p11"/>
+        <w:rPr>
+          <w:lang w:val="en-US"/>
+        </w:rPr>
+      </w:pPr>
+      <w:r>
+        <w:rPr>
+          <w:lang w:val="uk-UA"/>
+        </w:rPr>
+        <w:t xml:space="preserve">Що таке </w:t>
+      </w:r>
+      <w:r>
+        <w:rPr>
+          <w:lang w:val="en-US"/>
+        </w:rPr>
+        <w:t xml:space="preserve">Gradient Descent? </w:t>
+      </w:r>
+    </w:p>
+    <w:p>
+      <w:pPr>
+        <w:pStyle w:val="p11"/>
+        <w:rPr>
+          <w:lang w:val="uk-UA"/>
+        </w:rPr>
+      </w:pPr>
+      <w:r>
+        <w:rPr>
+          <w:lang w:val="uk-UA"/>
+        </w:rPr>
+        <w:t xml:space="preserve">Що таке </w:t>
+      </w:r>
+      <w:r>
+        <w:rPr>
+          <w:lang w:val="en-US"/>
+        </w:rPr>
+        <w:t>B</w:t>
+      </w:r>
+      <w:r>
+        <w:rPr>
+          <w:lang w:val="uk-UA"/>
+        </w:rPr>
+        <w:t>ackpropagation</w:t>
+      </w:r>
+      <w:r>
+        <w:rPr>
+          <w:lang w:val="en-US"/>
+        </w:rPr>
+        <w:t>?</w:t>
+      </w:r>
+    </w:p>
+    <w:p>
+      <w:pPr>
+        <w:pStyle w:val="p11"/>
+        <w:rPr>
+          <w:lang w:val="uk-UA"/>
+        </w:rPr>
+      </w:pPr>
+      <w:r>
+        <w:rPr>
+          <w:lang w:val="uk-UA"/>
+        </w:rPr>
+        <w:t xml:space="preserve">Що таке </w:t>
+      </w:r>
+      <w:r>
+        <w:rPr>
+          <w:lang w:val="en-US"/>
+        </w:rPr>
+        <w:t xml:space="preserve">Mean Squared Error? </w:t>
+      </w:r>
+      <w:r>
+        <w:rPr>
+          <w:lang w:val="uk-UA"/>
+        </w:rPr>
+        <w:t xml:space="preserve">Як він працює під капотом? </w:t>
+      </w:r>
+    </w:p>
+    <w:p>
+      <w:pPr>
+        <w:pStyle w:val="p11"/>
+        <w:rPr>
+          <w:lang w:val="en-US"/>
+        </w:rPr>
+      </w:pPr>
+      <w:r>
+        <w:rPr>
+          <w:lang w:val="en-US"/>
+        </w:rPr>
+      </w:r>
+    </w:p>
+    <w:p>
+      <w:pPr>
+        <w:pStyle w:val="h11"/>
+        <w:rPr/>
+      </w:pPr>
+      <w:r>
+        <w:rPr/>
+        <w:t>Вхідні дані</w:t>
+      </w:r>
+    </w:p>
+    <w:p>
+      <w:pPr>
+        <w:pStyle w:val="h11"/>
+        <w:rPr/>
+      </w:pPr>
+      <w:r>
+        <w:rPr/>
+        <w:t>Текст програми</w:t>
+      </w:r>
+    </w:p>
+    <w:p>
+      <w:pPr>
+        <w:pStyle w:val="h11"/>
+        <w:rPr/>
+      </w:pPr>
+      <w:r>
+        <w:rPr/>
+        <w:t>Результати</w:t>
+      </w:r>
+    </w:p>
+    <w:p>
+      <w:pPr>
+        <w:pStyle w:val="h11"/>
+        <w:rPr/>
+      </w:pPr>
+      <w:r>
+        <w:rPr/>
+        <w:t>Висновки</w:t>
+      </w:r>
+    </w:p>
+    <w:p>
+      <w:pPr>
+        <w:pStyle w:val="p11"/>
+        <w:rPr/>
+      </w:pPr>
+      <w:r>
+        <w:rPr/>
+      </w:r>
+    </w:p>
+    <w:p>
+      <w:pPr>
+        <w:pStyle w:val="p11"/>
+        <w:rPr/>
+      </w:pPr>
+      <w:r>
+        <w:rPr/>
+        <w:t>Отже, було навчено реалізовувати програмні проєкти у сфері інженерії програмного забезпечення, пов’язані з необхідністю обробки зображень.</w:t>
+      </w:r>
+    </w:p>
+    <w:p>
+      <w:pPr>
+        <w:pStyle w:val="p11"/>
+        <w:rPr/>
+      </w:pPr>
+      <w:r>
+        <w:rPr/>
+      </w:r>
+    </w:p>
+    <w:p>
+      <w:pPr>
+        <w:pStyle w:val="h11"/>
+        <w:rPr/>
+      </w:pPr>
+      <w:r>
+        <w:rPr/>
+        <w:t>Питання</w:t>
+      </w:r>
+    </w:p>
+    <w:p>
+      <w:pPr>
+        <w:pStyle w:val="H2"/>
+        <w:rPr/>
+      </w:pPr>
+      <w:r>
+        <w:rPr/>
+        <w:t>Поясніть поняття «Комп’ютерне бачення».</w:t>
+      </w:r>
+    </w:p>
+    <w:p>
+      <w:pPr>
+        <w:pStyle w:val="H2"/>
+        <w:rPr/>
+      </w:pPr>
+      <w:r>
+        <w:rPr/>
+        <w:t>Які задачі вирішує комп’ютерне бачення?</w:t>
       </w:r>
     </w:p>
     <w:p>
       <w:pPr>
         <w:pStyle w:val="P1"/>
-        <w:rPr>
-          <w:b w:val="false"/>
-          <w:bCs w:val="false"/>
-          <w:i/>
-          <w:iCs/>
-          <w:lang w:val="en-US"/>
-        </w:rPr>
-      </w:pPr>
-      <w:r>
-        <w:rPr>
-          <w:b w:val="false"/>
-          <w:bCs w:val="false"/>
-          <w:i/>
-          <w:iCs/>
-          <w:lang w:val="en-US"/>
-        </w:rPr>
+        <w:rPr/>
+      </w:pPr>
+      <w:r>
+        <w:rPr/>
+        <w:t xml:space="preserve"> </w:t>
       </w:r>
     </w:p>
     <w:p>
       <w:pPr>
         <w:pStyle w:val="P1"/>
-        <w:rPr>
-          <w:b w:val="false"/>
-          <w:bCs w:val="false"/>
-          <w:i w:val="false"/>
-          <w:iCs w:val="false"/>
-          <w:lang w:val="uk-UA"/>
-        </w:rPr>
-      </w:pPr>
-      <w:r>
-        <w:rPr>
-          <w:b w:val="false"/>
-          <w:bCs w:val="false"/>
-          <w:i w:val="false"/>
-          <w:iCs w:val="false"/>
-          <w:lang w:val="uk-UA"/>
-        </w:rPr>
-        <w:t>Кожен з них є кроком з метою мінімізувати показник АІС.</w:t>
+        <w:rPr/>
+      </w:pPr>
+      <w:r>
+        <w:rPr/>
+        <w:t>Комп’ютерне бачення вирішує такі задачі:</w:t>
       </w:r>
     </w:p>
     <w:p>
       <w:pPr>
         <w:pStyle w:val="P1"/>
-        <w:rPr>
-          <w:b w:val="false"/>
-          <w:bCs w:val="false"/>
-          <w:i w:val="false"/>
-          <w:iCs w:val="false"/>
-          <w:lang w:val="uk-UA"/>
-        </w:rPr>
-      </w:pPr>
-      <w:r>
-        <w:rPr>
-          <w:b w:val="false"/>
-          <w:bCs w:val="false"/>
-          <w:i w:val="false"/>
-          <w:iCs w:val="false"/>
+        <w:rPr/>
+      </w:pPr>
+      <w:r>
+        <w:rPr/>
+        <w:t>- класифікація зображення;</w:t>
+      </w:r>
+    </w:p>
+    <w:p>
+      <w:pPr>
+        <w:pStyle w:val="P1"/>
+        <w:rPr/>
+      </w:pPr>
+      <w:r>
+        <w:rPr/>
+        <w:t>- розпізнавання об’єктів;</w:t>
+      </w:r>
+    </w:p>
+    <w:p>
+      <w:pPr>
+        <w:pStyle w:val="P1"/>
+        <w:rPr/>
+      </w:pPr>
+      <w:r>
+        <w:rPr/>
+        <w:t>- сегментація зображення;</w:t>
+      </w:r>
+    </w:p>
+    <w:p>
+      <w:pPr>
+        <w:pStyle w:val="P1"/>
+        <w:rPr/>
+      </w:pPr>
+      <w:r>
+        <w:rPr/>
+        <w:t>- розпізнавання людей та облич;</w:t>
+      </w:r>
+    </w:p>
+    <w:p>
+      <w:pPr>
+        <w:pStyle w:val="P1"/>
+        <w:rPr/>
+      </w:pPr>
+      <w:r>
+        <w:rPr/>
+        <w:t>- відновлення зображення.</w:t>
+      </w:r>
+    </w:p>
+    <w:p>
+      <w:pPr>
+        <w:pStyle w:val="P1"/>
+        <w:rPr>
+          <w:lang w:val="uk-UA"/>
+        </w:rPr>
+      </w:pPr>
+      <w:hyperlink r:id="rId3">
+        <w:r>
+          <w:rPr>
+            <w:rStyle w:val="Hyperlink"/>
+            <w:lang w:val="uk-UA"/>
+          </w:rPr>
+          <w:t>Джерело</w:t>
+        </w:r>
+      </w:hyperlink>
+      <w:r>
+        <w:rPr>
+          <w:lang w:val="uk-UA"/>
+        </w:rPr>
+        <w:t>.</w:t>
+      </w:r>
+    </w:p>
+    <w:p>
+      <w:pPr>
+        <w:pStyle w:val="P1"/>
+        <w:rPr>
+          <w:lang w:val="uk-UA"/>
+        </w:rPr>
+      </w:pPr>
+      <w:r>
+        <w:rPr>
           <w:lang w:val="uk-UA"/>
         </w:rPr>
       </w:r>
@@ -1168,375 +2065,11 @@
     <w:p>
       <w:pPr>
         <w:pStyle w:val="H2"/>
-        <w:rPr>
-          <w:b w:val="false"/>
-          <w:bCs w:val="false"/>
-          <w:i/>
-          <w:iCs/>
-        </w:rPr>
-      </w:pPr>
-      <w:r>
-        <w:rPr>
-          <w:b w:val="false"/>
-          <w:bCs w:val="false"/>
-          <w:i/>
-          <w:iCs/>
-        </w:rPr>
-        <w:t xml:space="preserve">Що таке </w:t>
-      </w:r>
-      <w:r>
-        <w:rPr>
-          <w:b w:val="false"/>
-          <w:bCs w:val="false"/>
-          <w:i/>
-          <w:iCs/>
-          <w:lang w:val="en-US"/>
-        </w:rPr>
-        <w:t>AIC</w:t>
-      </w:r>
-      <w:r>
-        <w:rPr>
-          <w:b w:val="false"/>
-          <w:bCs w:val="false"/>
-          <w:i/>
-          <w:iCs/>
-        </w:rPr>
-        <w:t>?</w:t>
-      </w:r>
-    </w:p>
-    <w:p>
-      <w:pPr>
-        <w:pStyle w:val="P1"/>
-        <w:rPr>
-          <w:b w:val="false"/>
-          <w:bCs w:val="false"/>
-          <w:i/>
-          <w:iCs/>
-        </w:rPr>
-      </w:pPr>
-      <w:r>
-        <w:rPr>
-          <w:b w:val="false"/>
-          <w:bCs w:val="false"/>
-          <w:i/>
-          <w:iCs/>
-        </w:rPr>
-      </w:r>
-    </w:p>
-    <w:p>
-      <w:pPr>
-        <w:pStyle w:val="P1"/>
-        <w:rPr>
-          <w:b w:val="false"/>
-          <w:bCs w:val="false"/>
-          <w:i w:val="false"/>
-          <w:iCs w:val="false"/>
-          <w:lang w:val="en-US"/>
-        </w:rPr>
-      </w:pPr>
-      <w:r>
-        <w:rPr>
-          <w:b w:val="false"/>
-          <w:bCs w:val="false"/>
-          <w:i w:val="false"/>
-          <w:iCs w:val="false"/>
-          <w:lang w:val="en-US"/>
-        </w:rPr>
-        <w:t xml:space="preserve">AIC (Akaike information criterion, </w:t>
-      </w:r>
-      <w:r>
-        <w:rPr>
-          <w:b w:val="false"/>
-          <w:bCs w:val="false"/>
-          <w:i w:val="false"/>
-          <w:iCs w:val="false"/>
-          <w:lang w:val="uk-UA"/>
-        </w:rPr>
-        <w:t>Інформаційний критерій Акаіке) є оцінювачем похибки передбачувача.</w:t>
-      </w:r>
-    </w:p>
-    <w:p>
-      <w:pPr>
-        <w:pStyle w:val="P1"/>
-        <w:rPr>
-          <w:b w:val="false"/>
-          <w:bCs w:val="false"/>
-          <w:i/>
-          <w:iCs/>
-        </w:rPr>
-      </w:pPr>
-      <w:r>
-        <w:rPr>
-          <w:b w:val="false"/>
-          <w:bCs w:val="false"/>
-          <w:i/>
-          <w:iCs/>
-        </w:rPr>
-      </w:r>
-    </w:p>
-    <w:p>
-      <w:pPr>
-        <w:pStyle w:val="H2"/>
-        <w:rPr>
-          <w:b w:val="false"/>
-          <w:bCs w:val="false"/>
-          <w:i/>
-          <w:iCs/>
-        </w:rPr>
-      </w:pPr>
-      <w:r>
-        <w:rPr>
-          <w:b w:val="false"/>
-          <w:bCs w:val="false"/>
-          <w:i/>
-          <w:iCs/>
-        </w:rPr>
-        <w:t>Чому на графіках результатів частина з правильними результатами зміщена вниз?</w:t>
-      </w:r>
-    </w:p>
-    <w:p>
-      <w:pPr>
-        <w:pStyle w:val="p11"/>
-        <w:rPr/>
-      </w:pPr>
-      <w:r>
-        <w:rPr/>
-      </w:r>
-    </w:p>
-    <w:p>
-      <w:pPr>
-        <w:pStyle w:val="p11"/>
-        <w:rPr/>
-      </w:pPr>
-      <w:r>
-        <w:rPr/>
-        <w:t>Було виправлено шляхом додавання більшого інтервалу при розбитті на тестову та навчальну вибірки.</w:t>
-      </w:r>
-    </w:p>
-    <w:p>
-      <w:pPr>
-        <w:pStyle w:val="p11"/>
-        <w:rPr/>
-      </w:pPr>
-      <w:r>
-        <w:rPr/>
-      </w:r>
-    </w:p>
-    <w:p>
-      <w:pPr>
-        <w:pStyle w:val="h11"/>
-        <w:rPr/>
-      </w:pPr>
-      <w:r>
-        <w:rPr/>
-        <w:t>Питання</w:t>
-      </w:r>
-    </w:p>
-    <w:p>
-      <w:pPr>
-        <w:pStyle w:val="H2"/>
-        <w:spacing w:before="0" w:after="0"/>
-        <w:rPr/>
-      </w:pPr>
-      <w:r>
-        <w:rPr/>
-        <w:t xml:space="preserve">Що таке часовий ряд? </w:t>
-      </w:r>
-    </w:p>
-    <w:p>
-      <w:pPr>
-        <w:pStyle w:val="P1"/>
-        <w:spacing w:before="0" w:after="0"/>
-        <w:rPr/>
-      </w:pPr>
-      <w:r>
-        <w:rPr/>
-      </w:r>
-    </w:p>
-    <w:p>
-      <w:pPr>
-        <w:pStyle w:val="P1"/>
-        <w:spacing w:before="0" w:after="0"/>
-        <w:rPr/>
-      </w:pPr>
-      <w:r>
-        <w:rPr/>
-        <w:t xml:space="preserve">Часовий ряд є послідовністю точок даних, проіндексованих у хронологічному порядку. </w:t>
-      </w:r>
-    </w:p>
-    <w:p>
-      <w:pPr>
-        <w:pStyle w:val="P1"/>
-        <w:spacing w:before="0" w:after="0"/>
-        <w:rPr/>
-      </w:pPr>
-      <w:r>
-        <w:fldChar w:fldCharType="begin"/>
-      </w:r>
-      <w:r>
-        <w:rPr>
-          <w:rStyle w:val="Hyperlink"/>
-        </w:rPr>
-        <w:instrText xml:space="preserve"> HYPERLINK "https://sharpskill.dev/uk/technologies/data-science/pytannia-spivbesidy/time-series-forecasting" \l ":~:text=%D0%A7%D0%B0%D1%81%D0%BE%D0%B2%D0%B8%D0%B9%20%D1%80%D1%8F%D0%B4%20%E2%80%94%20%D1%86%D0%B5%20%D0%BF%D0%BE%D1%81%D0%BB%D1%96%D0%B4%D0%BE%D0%B2%D0%BD%D1%96%D1%81%D1%82%D1%8C%20%D1%82%D0%BE%D1%87%D0%BE%D0%BA%20%D0%B4%D0%B0%D0%BD%D0%B8%D1%85%2C%20%D0%BF%D1%80%D0%BE%D1%96%D0%BD%D0%B4%D0%B5%D0%BA%D1%81%D0%BE%D0%B2%D0%B0%D0%BD%D0%B8%D1%85%20%D1%83%20%D1%85%D1%80%D0%BE%D0%BD%D0%BE%D0%BB%D0%BE%D0%B3%D1%96%D1%87%D0%BD%D0%BE%D0%BC%D1%83%20%D0%BF%D0%BE%D1%80%D1%8F%D0%B4%D0%BA%D1%83.%20%D0%A1%D0%BF%D0%BE%D1%81%D1%82%D0%B5%D1%80%D0%B5%D0%B6%D0%B5%D0%BD%D0%BD%D1%8F%20%D0%B7%D0%B1%D0%B8%D1%80%D0%B0%D1%8E%D1%82%D1%8C%D1%81%D1%8F%20%D1%87%D0%B5%D1%80%D0%B5%D0%B7%20%D1%80%D0%B5%D0%B3%D1%83%D0%BB%D1%8F%D1%80%D0%BD%D1%96%20%D1%96%D0%BD%D1%82%D0%B5%D1%80%D0%B2%D0%B0%D0%BB%D0%B8%20(%D0%BF%D0%BE%D0%B3%D0%BE%D0%B4%D0%B8%D0%BD%D0%BD%D0%BE%2C%20%D1%89%D0%BE%D0%B4%D0%BD%D1%8F%2C%20%D1%89%D0%BE%D0%BC%D1%96%D1%81%D1%8F%D1%86%D1%8F)%20%D1%96%20%D1%87%D0%B0%D1%81%D1%82%D0%BE%20%D0%B4%D0%B5%D0%BC%D0%BE%D0%BD%D1%81%D1%82%D1%80%D1%83%D1%8E%D1%82%D1%8C%20%D1%87%D0%B0%D1%81%D0%BE%D0%B2%D1%96%20%D0%B7%D0%B0%D0%BB%D0%B5%D0%B6%D0%BD%D0%BE%D1%81%D1%82%D1%96.%20%D0%9A%D0%BB%D0%B0%D1%81%D0%B8%D1%87%D0%BD%D1%96%20%D0%BF%D1%80%D0%B8%D0%BA%D0%BB%D0%B0%D0%B4%D0%B8%3A%20%D1%86%D1%96%D0%BD%D0%B8%20%D0%B0%D0%BA%D1%86%D1%96%D0%B9%2C%20%D1%82%D0%B5%D0%BC%D0%BF%D0%B5%D1%80%D0%B0%D1%82%D1%83%D1%80%D0%B8%2C%20%D0%BC%D1%96%D1%81%D1%8F%D1%87%D0%BD%D1%96%20%D0%BF%D1%80%D0%BE%D0%B4%D0%B0%D0%B6%D1%96."</w:instrText>
-      </w:r>
-      <w:r>
-        <w:rPr>
-          <w:rStyle w:val="Hyperlink"/>
-        </w:rPr>
-        <w:fldChar w:fldCharType="separate"/>
-      </w:r>
-      <w:r>
-        <w:rPr>
-          <w:rStyle w:val="Hyperlink"/>
-        </w:rPr>
-        <w:t>Джерело</w:t>
-      </w:r>
-      <w:r>
-        <w:rPr>
-          <w:rStyle w:val="Hyperlink"/>
-        </w:rPr>
-        <w:fldChar w:fldCharType="end"/>
-      </w:r>
-      <w:r>
-        <w:rPr/>
-        <w:t>.</w:t>
-      </w:r>
-    </w:p>
-    <w:p>
-      <w:pPr>
-        <w:pStyle w:val="P1"/>
-        <w:spacing w:before="0" w:after="0"/>
-        <w:rPr/>
-      </w:pPr>
-      <w:r>
-        <w:rPr/>
-      </w:r>
-    </w:p>
-    <w:p>
-      <w:pPr>
-        <w:pStyle w:val="H2"/>
-        <w:rPr/>
-      </w:pPr>
-      <w:r>
-        <w:rPr/>
-        <w:t xml:space="preserve">Наведіть приклади даних, поданих у вигляді часових рядів. </w:t>
-      </w:r>
-    </w:p>
-    <w:p>
-      <w:pPr>
-        <w:pStyle w:val="P1"/>
-        <w:rPr/>
-      </w:pPr>
-      <w:r>
-        <w:rPr/>
-      </w:r>
-    </w:p>
-    <w:p>
-      <w:pPr>
-        <w:pStyle w:val="P1"/>
-        <w:rPr/>
-      </w:pPr>
-      <w:r>
-        <w:rPr/>
-        <w:t>Прикладами даних, поданих у вигляді часового рядку можуть бути:</w:t>
-      </w:r>
-    </w:p>
-    <w:p>
-      <w:pPr>
-        <w:pStyle w:val="P1"/>
-        <w:rPr/>
-      </w:pPr>
-      <w:r>
-        <w:rPr/>
-        <w:t>- кардіограма;</w:t>
-      </w:r>
-    </w:p>
-    <w:p>
-      <w:pPr>
-        <w:pStyle w:val="P1"/>
-        <w:rPr/>
-      </w:pPr>
-      <w:r>
-        <w:rPr/>
-        <w:t>- швидкість машини під час поїздки;</w:t>
-      </w:r>
-    </w:p>
-    <w:p>
-      <w:pPr>
-        <w:pStyle w:val="P1"/>
-        <w:rPr/>
-      </w:pPr>
-      <w:r>
-        <w:rPr/>
-        <w:t>- висота літака в різні моменти польоту.</w:t>
-      </w:r>
-    </w:p>
-    <w:p>
-      <w:pPr>
-        <w:pStyle w:val="P1"/>
-        <w:rPr/>
-      </w:pPr>
-      <w:r>
-        <w:rPr/>
-      </w:r>
-    </w:p>
-    <w:p>
-      <w:pPr>
-        <w:pStyle w:val="H2"/>
-        <w:rPr/>
-      </w:pPr>
-      <w:r>
-        <w:rPr/>
-        <w:t>У яких прикладних областях використовуються часові ряди?</w:t>
-      </w:r>
-    </w:p>
-    <w:p>
-      <w:pPr>
-        <w:pStyle w:val="P1"/>
-        <w:rPr/>
-      </w:pPr>
-      <w:r>
-        <w:rPr/>
-      </w:r>
-    </w:p>
-    <w:p>
-      <w:pPr>
-        <w:pStyle w:val="P1"/>
-        <w:rPr/>
-      </w:pPr>
-      <w:r>
-        <w:rPr/>
-        <w:t>Часові ряди можуть використовуватися в таких областях:</w:t>
-      </w:r>
-    </w:p>
-    <w:p>
-      <w:pPr>
-        <w:pStyle w:val="P1"/>
-        <w:rPr/>
-      </w:pPr>
-      <w:r>
-        <w:rPr/>
-        <w:t>- авіація;</w:t>
-      </w:r>
-    </w:p>
-    <w:p>
-      <w:pPr>
-        <w:pStyle w:val="P1"/>
-        <w:rPr/>
-      </w:pPr>
-      <w:r>
-        <w:rPr/>
-        <w:t>- автоспорт;</w:t>
-      </w:r>
-    </w:p>
-    <w:p>
-      <w:pPr>
-        <w:pStyle w:val="P1"/>
-        <w:rPr/>
-      </w:pPr>
-      <w:r>
-        <w:rPr/>
-        <w:t>- медицина.</w:t>
+        <w:rPr/>
+      </w:pPr>
+      <w:r>
+        <w:rPr/>
+        <w:t>У чому полягає суть розпізнавання зображень?</w:t>
       </w:r>
     </w:p>
     <w:sectPr>
@@ -2337,8 +2870,8 @@
       <w:lang w:val="en-US" w:eastAsia="uk-UA"/>
     </w:rPr>
   </w:style>
-  <w:style w:type="character" w:styleId="user">
-    <w:name w:val="Символ нумерації (user)"/>
+  <w:style w:type="character" w:styleId="Style12">
+    <w:name w:val="Символ нумерації"/>
     <w:qFormat/>
     <w:rPr/>
   </w:style>
@@ -2349,7 +2882,7 @@
       <w:u w:val="single"/>
     </w:rPr>
   </w:style>
-  <w:style w:type="paragraph" w:styleId="Style12">
+  <w:style w:type="paragraph" w:styleId="Style13">
     <w:name w:val="Заголовок"/>
     <w:basedOn w:val="Normal"/>
     <w:next w:val="BodyText"/>
@@ -2359,7 +2892,7 @@
       <w:spacing w:before="240" w:after="120"/>
     </w:pPr>
     <w:rPr>
-      <w:rFonts w:ascii="Liberation Sans" w:hAnsi="Liberation Sans" w:eastAsia="Microsoft YaHei" w:cs="Arial Unicode MS"/>
+      <w:rFonts w:ascii="Liberation Sans" w:hAnsi="Liberation Sans" w:eastAsia="Microsoft YaHei" w:cs="Lucida Sans"/>
       <w:sz w:val="28"/>
       <w:szCs w:val="28"/>
     </w:rPr>
@@ -2396,7 +2929,7 @@
       <w:szCs w:val="24"/>
     </w:rPr>
   </w:style>
-  <w:style w:type="paragraph" w:styleId="Style13">
+  <w:style w:type="paragraph" w:styleId="Style14">
     <w:name w:val="Покажчик"/>
     <w:basedOn w:val="Normal"/>
     <w:qFormat/>
@@ -2404,10 +2937,10 @@
       <w:suppressLineNumbers/>
     </w:pPr>
     <w:rPr>
-      <w:rFonts w:cs="Arial Unicode MS"/>
-    </w:rPr>
-  </w:style>
-  <w:style w:type="paragraph" w:styleId="user1">
+      <w:rFonts w:cs="Lucida Sans"/>
+    </w:rPr>
+  </w:style>
+  <w:style w:type="paragraph" w:styleId="user">
     <w:name w:val="Заголовок (user)"/>
     <w:basedOn w:val="Normal"/>
     <w:next w:val="BodyText"/>
@@ -2417,12 +2950,12 @@
       <w:spacing w:before="240" w:after="120"/>
     </w:pPr>
     <w:rPr>
-      <w:rFonts w:ascii="Liberation Sans" w:hAnsi="Liberation Sans" w:eastAsia="Microsoft YaHei" w:cs="Lucida Sans"/>
+      <w:rFonts w:ascii="Liberation Sans" w:hAnsi="Liberation Sans" w:eastAsia="Microsoft YaHei" w:cs="Arial Unicode MS"/>
       <w:sz w:val="28"/>
       <w:szCs w:val="28"/>
     </w:rPr>
   </w:style>
-  <w:style w:type="paragraph" w:styleId="user2">
+  <w:style w:type="paragraph" w:styleId="user1">
     <w:name w:val="Покажчик (user)"/>
     <w:basedOn w:val="Normal"/>
     <w:qFormat/>
@@ -2430,12 +2963,12 @@
       <w:suppressLineNumbers/>
     </w:pPr>
     <w:rPr>
-      <w:rFonts w:cs="Lucida Sans"/>
+      <w:rFonts w:cs="Arial Unicode MS"/>
     </w:rPr>
   </w:style>
   <w:style w:type="paragraph" w:styleId="IndexHeading">
     <w:name w:val="index heading"/>
-    <w:basedOn w:val="Style12"/>
+    <w:basedOn w:val="user"/>
     <w:pPr/>
     <w:rPr/>
   </w:style>
@@ -2711,8 +3244,8 @@
     </w:pPr>
     <w:rPr/>
   </w:style>
-  <w:style w:type="paragraph" w:styleId="user3">
-    <w:name w:val="Верхній і нижній колонтитули (user)"/>
+  <w:style w:type="paragraph" w:styleId="Style15">
+    <w:name w:val="Верхній і нижній колонтитули"/>
     <w:basedOn w:val="Normal"/>
     <w:qFormat/>
     <w:pPr>
@@ -2725,8 +3258,8 @@
     </w:pPr>
     <w:rPr/>
   </w:style>
-  <w:style w:type="paragraph" w:styleId="Style14">
-    <w:name w:val="Верхній і нижній колонтитули"/>
+  <w:style w:type="paragraph" w:styleId="user2">
+    <w:name w:val="Верхній і нижній колонтитули (user)"/>
     <w:basedOn w:val="Normal"/>
     <w:qFormat/>
     <w:pPr/>
@@ -2734,14 +3267,31 @@
   </w:style>
   <w:style w:type="paragraph" w:styleId="Header">
     <w:name w:val="header"/>
-    <w:basedOn w:val="user3"/>
+    <w:basedOn w:val="Style15"/>
     <w:pPr>
       <w:suppressLineNumbers/>
     </w:pPr>
     <w:rPr/>
   </w:style>
-  <w:style w:type="numbering" w:styleId="Style15" w:default="1">
-    <w:name w:val="Без маркерів"/>
+  <w:style w:type="paragraph" w:styleId="user3">
+    <w:name w:val="Горизонтальна лінія (user)"/>
+    <w:basedOn w:val="Normal"/>
+    <w:next w:val="BodyText"/>
+    <w:qFormat/>
+    <w:pPr>
+      <w:suppressLineNumbers/>
+      <w:pBdr>
+        <w:bottom w:val="double" w:sz="2" w:space="0" w:color="808080"/>
+      </w:pBdr>
+      <w:spacing w:before="0" w:after="283"/>
+    </w:pPr>
+    <w:rPr>
+      <w:sz w:val="12"/>
+      <w:szCs w:val="12"/>
+    </w:rPr>
+  </w:style>
+  <w:style w:type="numbering" w:styleId="user4" w:default="1">
+    <w:name w:val="Без маркерів (user)"/>
     <w:uiPriority w:val="99"/>
     <w:semiHidden/>
     <w:unhideWhenUsed/>

</xml_diff>

<commit_message>
feat: add the code from TF docs tutorial
</commit_message>
<xml_diff>
--- a/51IP Injenerija prykladnyh zastosunkiv/2/IP_KNT-122_Onyshchenko_19_PR2.docx
+++ b/51IP Injenerija prykladnyh zastosunkiv/2/IP_KNT-122_Onyshchenko_19_PR2.docx
@@ -692,7 +692,7 @@
       </w:pPr>
       <w:r>
         <w:rPr/>
-        <w:t>Під час читання методичних вказівок виникали такі питання:</w:t>
+        <w:t>Під час читання методичних вказівок і надалі виникали такі питання:</w:t>
       </w:r>
     </w:p>
     <w:p>
@@ -1602,61 +1602,149 @@
       </w:pPr>
       <w:r>
         <w:rPr>
+          <w:b/>
+          <w:bCs/>
           <w:lang w:val="uk-UA"/>
         </w:rPr>
         <w:t xml:space="preserve">Що таке </w:t>
       </w:r>
       <w:r>
         <w:rPr>
+          <w:b/>
+          <w:bCs/>
           <w:lang w:val="en-US"/>
         </w:rPr>
         <w:t xml:space="preserve">finite automata? </w:t>
       </w:r>
-    </w:p>
-    <w:p>
-      <w:pPr>
-        <w:pStyle w:val="p11"/>
-        <w:rPr>
-          <w:lang w:val="uk-UA"/>
-        </w:rPr>
-      </w:pPr>
-      <w:r>
-        <w:rPr>
+      <w:r>
+        <w:rPr>
+          <w:lang w:val="uk-UA"/>
+        </w:rPr>
+        <w:t xml:space="preserve">Скінченний автомат (або </w:t>
+      </w:r>
+      <w:r>
+        <w:rPr>
+          <w:lang w:val="en-US"/>
+        </w:rPr>
+        <w:t xml:space="preserve">finite automaton) </w:t>
+      </w:r>
+      <w:r>
+        <w:rPr>
+          <w:lang w:val="uk-UA"/>
+        </w:rPr>
+        <w:t>це математична модель, яка містить скінченну кількість станів та переходи між ними.</w:t>
+      </w:r>
+    </w:p>
+    <w:p>
+      <w:pPr>
+        <w:pStyle w:val="p11"/>
+        <w:rPr>
+          <w:lang w:val="uk-UA"/>
+        </w:rPr>
+      </w:pPr>
+      <w:r>
+        <w:rPr>
+          <w:b/>
+          <w:bCs/>
           <w:lang w:val="uk-UA"/>
         </w:rPr>
         <w:t xml:space="preserve">В чому різниця між </w:t>
       </w:r>
       <w:r>
         <w:rPr>
+          <w:b/>
+          <w:bCs/>
           <w:lang w:val="en-US"/>
         </w:rPr>
         <w:t xml:space="preserve">DFA </w:t>
       </w:r>
       <w:r>
         <w:rPr>
+          <w:b/>
+          <w:bCs/>
           <w:lang w:val="uk-UA"/>
         </w:rPr>
         <w:t xml:space="preserve">та </w:t>
       </w:r>
       <w:r>
         <w:rPr>
+          <w:b/>
+          <w:bCs/>
           <w:lang w:val="en-US"/>
         </w:rPr>
         <w:t xml:space="preserve">NFA? </w:t>
       </w:r>
-    </w:p>
-    <w:p>
-      <w:pPr>
-        <w:pStyle w:val="p11"/>
-        <w:rPr>
-          <w:lang w:val="uk-UA"/>
-        </w:rPr>
-      </w:pPr>
-      <w:r>
-        <w:rPr>
-          <w:lang w:val="uk-UA"/>
-        </w:rPr>
-        <w:t xml:space="preserve">Що таке машина станів? </w:t>
+      <w:r>
+        <w:rPr>
+          <w:lang w:val="en-US"/>
+        </w:rPr>
+        <w:t xml:space="preserve">DFA (Deterministic Finite Automata) </w:t>
+      </w:r>
+      <w:r>
+        <w:rPr>
+          <w:lang w:val="uk-UA"/>
+        </w:rPr>
+        <w:t xml:space="preserve">та </w:t>
+      </w:r>
+      <w:r>
+        <w:rPr>
+          <w:lang w:val="en-US"/>
+        </w:rPr>
+        <w:t xml:space="preserve">NFA (Non-deterministic finite automata) </w:t>
+      </w:r>
+      <w:r>
+        <w:rPr>
+          <w:lang w:val="uk-UA"/>
+        </w:rPr>
+        <w:t xml:space="preserve">відрізняються тим, що </w:t>
+      </w:r>
+      <w:r>
+        <w:rPr>
+          <w:lang w:val="en-US"/>
+        </w:rPr>
+        <w:t xml:space="preserve">DFA </w:t>
+      </w:r>
+      <w:r>
+        <w:rPr>
+          <w:lang w:val="uk-UA"/>
+        </w:rPr>
+        <w:t xml:space="preserve">має лише один варіант переходу між станами, а </w:t>
+      </w:r>
+      <w:r>
+        <w:rPr>
+          <w:lang w:val="en-US"/>
+        </w:rPr>
+        <w:t xml:space="preserve">NFA </w:t>
+      </w:r>
+      <w:r>
+        <w:rPr>
+          <w:lang w:val="uk-UA"/>
+        </w:rPr>
+        <w:t xml:space="preserve">може мати кілька або жодного. Також </w:t>
+      </w:r>
+      <w:r>
+        <w:rPr>
+          <w:lang w:val="en-US"/>
+        </w:rPr>
+        <w:t xml:space="preserve">NFA </w:t>
+      </w:r>
+      <w:r>
+        <w:rPr>
+          <w:lang w:val="uk-UA"/>
+        </w:rPr>
+        <w:t xml:space="preserve">може містити </w:t>
+      </w:r>
+      <w:r>
+        <w:rPr>
+          <w:lang w:val="en-US"/>
+        </w:rPr>
+        <w:t>epsilon-</w:t>
+      </w:r>
+      <w:r>
+        <w:rPr>
+          <w:lang w:val="uk-UA"/>
+        </w:rPr>
+        <w:t xml:space="preserve">переходи. Це є переходи без читання символу. </w:t>
       </w:r>
     </w:p>
     <w:p>
@@ -1706,65 +1794,151 @@
       </w:pPr>
       <w:r>
         <w:rPr>
+          <w:b/>
+          <w:bCs/>
           <w:lang w:val="uk-UA"/>
         </w:rPr>
         <w:t>Де зберігаються дані програми під час її виконання? В оперативній пам’яті?</w:t>
       </w:r>
-    </w:p>
-    <w:p>
-      <w:pPr>
-        <w:pStyle w:val="p11"/>
-        <w:rPr>
-          <w:lang w:val="uk-UA"/>
-        </w:rPr>
-      </w:pPr>
-      <w:r>
-        <w:rPr>
-          <w:lang w:val="uk-UA"/>
-        </w:rPr>
-        <w:t>Як працює оперативна пам’ять?</w:t>
-      </w:r>
-    </w:p>
-    <w:p>
-      <w:pPr>
-        <w:pStyle w:val="p11"/>
-        <w:rPr>
-          <w:lang w:val="uk-UA"/>
-        </w:rPr>
-      </w:pPr>
-      <w:r>
-        <w:rPr>
+      <w:r>
+        <w:rPr>
+          <w:lang w:val="uk-UA"/>
+        </w:rPr>
+        <w:t xml:space="preserve"> Так, дані під час виконання програми зберігаються в оперативній пам’яті.</w:t>
+      </w:r>
+    </w:p>
+    <w:p>
+      <w:pPr>
+        <w:pStyle w:val="p11"/>
+        <w:rPr>
+          <w:lang w:val="en-US"/>
+        </w:rPr>
+      </w:pPr>
+      <w:r>
+        <w:rPr>
+          <w:b/>
+          <w:bCs/>
+          <w:lang w:val="uk-UA"/>
+        </w:rPr>
+        <w:t xml:space="preserve">Як працює оперативна пам’ять? </w:t>
+      </w:r>
+      <w:r>
+        <w:rPr>
+          <w:lang w:val="uk-UA"/>
+        </w:rPr>
+        <w:t xml:space="preserve">Зберігаючи біти у комірках за адресами, зазначеними </w:t>
+      </w:r>
+      <w:r>
+        <w:rPr>
+          <w:lang w:val="en-US"/>
+        </w:rPr>
+        <w:t>CPU.</w:t>
+      </w:r>
+    </w:p>
+    <w:p>
+      <w:pPr>
+        <w:pStyle w:val="p11"/>
+        <w:rPr>
+          <w:lang w:val="uk-UA"/>
+        </w:rPr>
+      </w:pPr>
+      <w:r>
+        <w:rPr>
+          <w:b/>
+          <w:bCs/>
           <w:lang w:val="uk-UA"/>
         </w:rPr>
         <w:t>Як оперативна пам’ять взаємодіє з процесором?</w:t>
       </w:r>
-    </w:p>
-    <w:p>
-      <w:pPr>
-        <w:pStyle w:val="p11"/>
-        <w:rPr>
-          <w:lang w:val="uk-UA"/>
-        </w:rPr>
-      </w:pPr>
-      <w:r>
-        <w:rPr>
-          <w:lang w:val="uk-UA"/>
-        </w:rPr>
-        <w:t>Що робить процесор під час виконання програм?</w:t>
-      </w:r>
-    </w:p>
-    <w:p>
-      <w:pPr>
-        <w:pStyle w:val="p11"/>
-        <w:rPr>
-          <w:lang w:val="uk-UA"/>
-        </w:rPr>
-      </w:pPr>
-      <w:r>
-        <w:rPr>
-          <w:lang w:val="uk-UA"/>
-        </w:rPr>
-        <w:t>Що це за одне значення яке отримує програма під час застосування фільтру на кожному кроці?</w:t>
+      <w:r>
+        <w:rPr>
+          <w:lang w:val="uk-UA"/>
+        </w:rPr>
+        <w:t xml:space="preserve"> Через контролер пам’яті.</w:t>
+      </w:r>
+    </w:p>
+    <w:p>
+      <w:pPr>
+        <w:pStyle w:val="p11"/>
+        <w:rPr>
+          <w:lang w:val="uk-UA"/>
+        </w:rPr>
+      </w:pPr>
+      <w:r>
+        <w:rPr>
+          <w:b/>
+          <w:bCs/>
+          <w:lang w:val="uk-UA"/>
+        </w:rPr>
+        <w:t xml:space="preserve">Що робить процесор під час виконання програм? </w:t>
+      </w:r>
+      <w:r>
+        <w:rPr>
+          <w:lang w:val="uk-UA"/>
+        </w:rPr>
+        <w:t>Читає та виконує записані у програмі інструкції.</w:t>
+      </w:r>
+    </w:p>
+    <w:p>
+      <w:pPr>
+        <w:pStyle w:val="p11"/>
+        <w:rPr>
+          <w:lang w:val="uk-UA"/>
+        </w:rPr>
+      </w:pPr>
+      <w:r>
+        <w:rPr>
+          <w:b/>
+          <w:bCs/>
+          <w:lang w:val="uk-UA"/>
+        </w:rPr>
+        <w:t xml:space="preserve">Що це за одне значення яке отримує програма під час застосування фільтру на кожному кроці? </w:t>
+      </w:r>
+      <w:r>
+        <w:rPr>
+          <w:lang w:val="uk-UA"/>
+        </w:rPr>
+        <w:t>Це число активації, яке далі вноситься до</w:t>
+      </w:r>
+      <w:r>
+        <w:rPr>
+          <w:lang w:val="en-US"/>
+        </w:rPr>
+        <w:t xml:space="preserve"> </w:t>
+      </w:r>
+      <w:r>
+        <w:rPr>
+          <w:lang w:val="uk-UA"/>
+        </w:rPr>
+        <w:t xml:space="preserve">мапи ознак </w:t>
+      </w:r>
+      <w:r>
+        <w:rPr>
+          <w:lang w:val="en-US"/>
+        </w:rPr>
+        <w:t>(</w:t>
+      </w:r>
+      <w:r>
+        <w:rPr>
+          <w:b w:val="false"/>
+          <w:bCs w:val="false"/>
+          <w:i/>
+          <w:iCs/>
+          <w:lang w:val="uk-UA"/>
+        </w:rPr>
+        <w:t xml:space="preserve">Англійською </w:t>
+      </w:r>
+      <w:r>
+        <w:rPr>
+          <w:lang w:val="en-US"/>
+        </w:rPr>
+        <w:t>features map)</w:t>
+      </w:r>
+      <w:r>
+        <w:rPr>
+          <w:lang w:val="uk-UA"/>
+        </w:rPr>
+        <w:t>.</w:t>
       </w:r>
     </w:p>
     <w:p>
@@ -1843,6 +2017,152 @@
           <w:lang w:val="uk-UA"/>
         </w:rPr>
         <w:t xml:space="preserve">Як він працює під капотом? </w:t>
+      </w:r>
+    </w:p>
+    <w:p>
+      <w:pPr>
+        <w:pStyle w:val="p11"/>
+        <w:rPr>
+          <w:lang w:val="uk-UA"/>
+        </w:rPr>
+      </w:pPr>
+      <w:r>
+        <w:rPr>
+          <w:b/>
+          <w:bCs/>
+          <w:lang w:val="uk-UA"/>
+        </w:rPr>
+        <w:t xml:space="preserve">Що таке </w:t>
+      </w:r>
+      <w:r>
+        <w:rPr>
+          <w:b/>
+          <w:bCs/>
+          <w:lang w:val="en-US"/>
+        </w:rPr>
+        <w:t xml:space="preserve">loss? </w:t>
+      </w:r>
+      <w:r>
+        <w:rPr>
+          <w:lang w:val="en-US"/>
+        </w:rPr>
+        <w:t xml:space="preserve">Loss </w:t>
+      </w:r>
+      <w:r>
+        <w:rPr>
+          <w:lang w:val="uk-UA"/>
+        </w:rPr>
+        <w:t>це наскільки вихід моделі відрізняється від правильного значення.</w:t>
+      </w:r>
+    </w:p>
+    <w:p>
+      <w:pPr>
+        <w:pStyle w:val="p11"/>
+        <w:rPr>
+          <w:lang w:val="en-US"/>
+        </w:rPr>
+      </w:pPr>
+      <w:r>
+        <w:rPr>
+          <w:lang w:val="uk-UA"/>
+        </w:rPr>
+        <w:t xml:space="preserve">Що таке </w:t>
+      </w:r>
+      <w:r>
+        <w:rPr>
+          <w:lang w:val="en-US"/>
+        </w:rPr>
+        <w:t>ROC к</w:t>
+      </w:r>
+      <w:r>
+        <w:rPr>
+          <w:lang w:val="uk-UA"/>
+        </w:rPr>
+        <w:t>рива</w:t>
+      </w:r>
+      <w:r>
+        <w:rPr>
+          <w:lang w:val="en-US"/>
+        </w:rPr>
+        <w:t xml:space="preserve">? </w:t>
+      </w:r>
+    </w:p>
+    <w:p>
+      <w:pPr>
+        <w:pStyle w:val="p11"/>
+        <w:rPr>
+          <w:lang w:val="uk-UA"/>
+        </w:rPr>
+      </w:pPr>
+      <w:r>
+        <w:rPr>
+          <w:b/>
+          <w:bCs/>
+          <w:lang w:val="uk-UA"/>
+        </w:rPr>
+        <w:t xml:space="preserve">Що таке матриця невідповідностей? </w:t>
+      </w:r>
+      <w:r>
+        <w:rPr>
+          <w:lang w:val="en-US"/>
+        </w:rPr>
+        <w:t>Confusion Matrix (</w:t>
+      </w:r>
+      <w:r>
+        <w:rPr>
+          <w:lang w:val="uk-UA"/>
+        </w:rPr>
+        <w:t xml:space="preserve">Українською </w:t>
+      </w:r>
+      <w:r>
+        <w:rPr>
+          <w:i/>
+          <w:iCs/>
+          <w:lang w:val="uk-UA"/>
+        </w:rPr>
+        <w:t>матриця невідповідностей</w:t>
+      </w:r>
+      <w:r>
+        <w:rPr>
+          <w:lang w:val="uk-UA"/>
+        </w:rPr>
+        <w:t xml:space="preserve">) це матриця, в якій показуються </w:t>
+      </w:r>
+      <w:r>
+        <w:rPr>
+          <w:lang w:val="en-US"/>
+        </w:rPr>
+        <w:t xml:space="preserve">True Positive, True Negative </w:t>
+      </w:r>
+      <w:r>
+        <w:rPr>
+          <w:lang w:val="uk-UA"/>
+        </w:rPr>
+        <w:t xml:space="preserve">та </w:t>
+      </w:r>
+      <w:r>
+        <w:rPr>
+          <w:lang w:val="en-US"/>
+        </w:rPr>
+        <w:t xml:space="preserve">False Positive </w:t>
+      </w:r>
+      <w:r>
+        <w:rPr>
+          <w:lang w:val="uk-UA"/>
+        </w:rPr>
+        <w:t xml:space="preserve">і </w:t>
+      </w:r>
+      <w:r>
+        <w:rPr>
+          <w:lang w:val="en-US"/>
+        </w:rPr>
+        <w:t xml:space="preserve">False Negative </w:t>
+      </w:r>
+      <w:r>
+        <w:rPr>
+          <w:lang w:val="uk-UA"/>
+        </w:rPr>
+        <w:t>результати роботи моделі.</w:t>
       </w:r>
     </w:p>
     <w:p>

</xml_diff>

<commit_message>
chore: following the guides
</commit_message>
<xml_diff>
--- a/51IP Injenerija prykladnyh zastosunkiv/2/IP_KNT-122_Onyshchenko_19_PR2.docx
+++ b/51IP Injenerija prykladnyh zastosunkiv/2/IP_KNT-122_Onyshchenko_19_PR2.docx
@@ -1939,84 +1939,6 @@
           <w:lang w:val="uk-UA"/>
         </w:rPr>
         <w:t>.</w:t>
-      </w:r>
-    </w:p>
-    <w:p>
-      <w:pPr>
-        <w:pStyle w:val="p11"/>
-        <w:rPr>
-          <w:lang w:val="en-US"/>
-        </w:rPr>
-      </w:pPr>
-      <w:r>
-        <w:rPr>
-          <w:lang w:val="uk-UA"/>
-        </w:rPr>
-        <w:t xml:space="preserve">Що таке </w:t>
-      </w:r>
-      <w:r>
-        <w:rPr>
-          <w:lang w:val="en-US"/>
-        </w:rPr>
-        <w:t xml:space="preserve">Gradient Descent? </w:t>
-      </w:r>
-    </w:p>
-    <w:p>
-      <w:pPr>
-        <w:pStyle w:val="p11"/>
-        <w:rPr>
-          <w:lang w:val="uk-UA"/>
-        </w:rPr>
-      </w:pPr>
-      <w:r>
-        <w:rPr>
-          <w:lang w:val="uk-UA"/>
-        </w:rPr>
-        <w:t xml:space="preserve">Що таке </w:t>
-      </w:r>
-      <w:r>
-        <w:rPr>
-          <w:lang w:val="en-US"/>
-        </w:rPr>
-        <w:t>B</w:t>
-      </w:r>
-      <w:r>
-        <w:rPr>
-          <w:lang w:val="uk-UA"/>
-        </w:rPr>
-        <w:t>ackpropagation</w:t>
-      </w:r>
-      <w:r>
-        <w:rPr>
-          <w:lang w:val="en-US"/>
-        </w:rPr>
-        <w:t>?</w:t>
-      </w:r>
-    </w:p>
-    <w:p>
-      <w:pPr>
-        <w:pStyle w:val="p11"/>
-        <w:rPr>
-          <w:lang w:val="uk-UA"/>
-        </w:rPr>
-      </w:pPr>
-      <w:r>
-        <w:rPr>
-          <w:lang w:val="uk-UA"/>
-        </w:rPr>
-        <w:t xml:space="preserve">Що таке </w:t>
-      </w:r>
-      <w:r>
-        <w:rPr>
-          <w:lang w:val="en-US"/>
-        </w:rPr>
-        <w:t xml:space="preserve">Mean Squared Error? </w:t>
-      </w:r>
-      <w:r>
-        <w:rPr>
-          <w:lang w:val="uk-UA"/>
-        </w:rPr>
-        <w:t xml:space="preserve">Як він працює під капотом? </w:t>
       </w:r>
     </w:p>
     <w:p>

</xml_diff>